<commit_message>
EN.KL-ST-01 Rev05: tablolar altına yanlışlıkla kopyalanan geçirgenlik formülü kaldırıldı
Co-Authored-By: Claude Opus 5.5 <noreply@anthropic.com>
Claude-Session: https://claude.ai/code/session_01MYFLLArEmqJeJcqLHFFyb8
</commit_message>
<xml_diff>
--- a/EN.KL-ST-01/EN.KL-ST-01 FV Modül Temperli ve Yarı Temperli Cam Şartnamesi Rev05.docx
+++ b/EN.KL-ST-01/EN.KL-ST-01 FV Modül Temperli ve Yarı Temperli Cam Şartnamesi Rev05.docx
@@ -7797,8 +7797,8 @@
     </w:tbl>
     <w:p>
       <w:pPr>
-        <w:spacing w:before="80" w:after="80" w:line="312" w:lineRule="auto"/>
-        <w:jc w:val="center"/>
+        <w:spacing w:after="80" w:line="276" w:lineRule="auto"/>
+        <w:jc w:val="both"/>
         <w:rPr>
           <w:rFonts w:ascii="Arial" w:hAnsi="Arial" w:cs="Arial"/>
           <w:iCs/>
@@ -7806,242 +7806,14 @@
           <w:szCs w:val="20"/>
         </w:rPr>
       </w:pPr>
-      <m:oMathPara>
-        <m:oMath>
-          <m:sSub>
-            <m:sSubPr>
-              <m:ctrlPr>
-                <w:rPr>
-                  <w:rFonts w:ascii="Cambria Math" w:hAnsi="Cambria Math" w:cs="Arial"/>
-                  <w:i/>
-                  <w:sz w:val="20"/>
-                  <w:szCs w:val="20"/>
-                </w:rPr>
-              </m:ctrlPr>
-            </m:sSubPr>
-            <m:e>
-              <m:r>
-                <w:rPr>
-                  <w:rFonts w:ascii="Cambria Math" w:hAnsi="Cambria Math" w:cs="Arial"/>
-                  <w:sz w:val="20"/>
-                  <w:szCs w:val="20"/>
-                </w:rPr>
-                <m:t>τ</m:t>
-              </m:r>
-            </m:e>
-            <m:sub>
-              <m:r>
-                <w:rPr>
-                  <w:rFonts w:ascii="Cambria Math" w:hAnsi="Cambria Math" w:cs="Arial"/>
-                  <w:sz w:val="20"/>
-                  <w:szCs w:val="20"/>
-                </w:rPr>
-                <m:t>PV</m:t>
-              </m:r>
-            </m:sub>
-          </m:sSub>
-          <m:r>
-            <w:rPr>
-              <w:rFonts w:ascii="Cambria Math" w:hAnsi="Cambria Math" w:cs="Arial"/>
-              <w:sz w:val="20"/>
-              <w:szCs w:val="20"/>
-            </w:rPr>
-            <m:t>=</m:t>
-          </m:r>
-          <m:f>
-            <m:fPr>
-              <m:ctrlPr>
-                <w:rPr>
-                  <w:rFonts w:ascii="Cambria Math" w:hAnsi="Cambria Math" w:cs="Arial"/>
-                  <w:i/>
-                  <w:sz w:val="20"/>
-                  <w:szCs w:val="20"/>
-                </w:rPr>
-              </m:ctrlPr>
-            </m:fPr>
-            <m:num>
-              <m:nary>
-                <m:naryPr>
-                  <m:chr m:val="∑"/>
-                  <m:ctrlPr>
-                    <w:rPr>
-                      <w:rFonts w:ascii="Cambria Math" w:hAnsi="Cambria Math" w:cs="Arial"/>
-                      <w:i/>
-                      <w:sz w:val="20"/>
-                      <w:szCs w:val="20"/>
-                    </w:rPr>
-                  </m:ctrlPr>
-                </m:naryPr>
-                <m:sub>
-                  <m:r>
-                    <w:rPr>
-                      <w:rFonts w:ascii="Cambria Math" w:hAnsi="Cambria Math" w:cs="Arial"/>
-                      <w:sz w:val="20"/>
-                      <w:szCs w:val="20"/>
-                    </w:rPr>
-                    <m:t>λ=380</m:t>
-                  </m:r>
-                </m:sub>
-                <m:sup>
-                  <m:r>
-                    <w:rPr>
-                      <w:rFonts w:ascii="Cambria Math" w:hAnsi="Cambria Math" w:cs="Arial"/>
-                      <w:sz w:val="20"/>
-                      <w:szCs w:val="20"/>
-                    </w:rPr>
-                    <m:t>1100</m:t>
-                  </m:r>
-                </m:sup>
-                <m:e>
-                  <m:r>
-                    <w:rPr>
-                      <w:rFonts w:ascii="Cambria Math" w:hAnsi="Cambria Math" w:cs="Arial"/>
-                      <w:sz w:val="20"/>
-                      <w:szCs w:val="20"/>
-                    </w:rPr>
-                    <m:t>τ</m:t>
-                  </m:r>
-                  <m:d>
-                    <m:dPr>
-                      <m:ctrlPr>
-                        <w:rPr>
-                          <w:rFonts w:ascii="Cambria Math" w:hAnsi="Cambria Math" w:cs="Arial"/>
-                          <w:i/>
-                          <w:sz w:val="20"/>
-                          <w:szCs w:val="20"/>
-                        </w:rPr>
-                      </m:ctrlPr>
-                    </m:dPr>
-                    <m:e>
-                      <m:r>
-                        <w:rPr>
-                          <w:rFonts w:ascii="Cambria Math" w:hAnsi="Cambria Math" w:cs="Arial"/>
-                          <w:sz w:val="20"/>
-                          <w:szCs w:val="20"/>
-                        </w:rPr>
-                        <m:t>λ</m:t>
-                      </m:r>
-                    </m:e>
-                  </m:d>
-                  <m:r>
-                    <w:rPr>
-                      <w:rFonts w:ascii="Cambria Math" w:hAnsi="Cambria Math" w:cs="Arial"/>
-                      <w:sz w:val="20"/>
-                      <w:szCs w:val="20"/>
-                    </w:rPr>
-                    <m:t>·E</m:t>
-                  </m:r>
-                  <m:d>
-                    <m:dPr>
-                      <m:ctrlPr>
-                        <w:rPr>
-                          <w:rFonts w:ascii="Cambria Math" w:hAnsi="Cambria Math" w:cs="Arial"/>
-                          <w:i/>
-                          <w:sz w:val="20"/>
-                          <w:szCs w:val="20"/>
-                        </w:rPr>
-                      </m:ctrlPr>
-                    </m:dPr>
-                    <m:e>
-                      <m:r>
-                        <w:rPr>
-                          <w:rFonts w:ascii="Cambria Math" w:hAnsi="Cambria Math" w:cs="Arial"/>
-                          <w:sz w:val="20"/>
-                          <w:szCs w:val="20"/>
-                        </w:rPr>
-                        <m:t>λ</m:t>
-                      </m:r>
-                    </m:e>
-                  </m:d>
-                  <m:r>
-                    <w:rPr>
-                      <w:rFonts w:ascii="Cambria Math" w:hAnsi="Cambria Math" w:cs="Arial"/>
-                      <w:sz w:val="20"/>
-                      <w:szCs w:val="20"/>
-                    </w:rPr>
-                    <m:t>·Δλ</m:t>
-                  </m:r>
-                </m:e>
-              </m:nary>
-            </m:num>
-            <m:den>
-              <m:nary>
-                <m:naryPr>
-                  <m:chr m:val="∑"/>
-                  <m:ctrlPr>
-                    <w:rPr>
-                      <w:rFonts w:ascii="Cambria Math" w:hAnsi="Cambria Math" w:cs="Arial"/>
-                      <w:i/>
-                      <w:sz w:val="20"/>
-                      <w:szCs w:val="20"/>
-                    </w:rPr>
-                  </m:ctrlPr>
-                </m:naryPr>
-                <m:sub>
-                  <m:r>
-                    <w:rPr>
-                      <w:rFonts w:ascii="Cambria Math" w:hAnsi="Cambria Math" w:cs="Arial"/>
-                      <w:sz w:val="20"/>
-                      <w:szCs w:val="20"/>
-                    </w:rPr>
-                    <m:t>λ=380</m:t>
-                  </m:r>
-                </m:sub>
-                <m:sup>
-                  <m:r>
-                    <w:rPr>
-                      <w:rFonts w:ascii="Cambria Math" w:hAnsi="Cambria Math" w:cs="Arial"/>
-                      <w:sz w:val="20"/>
-                      <w:szCs w:val="20"/>
-                    </w:rPr>
-                    <m:t>1100</m:t>
-                  </m:r>
-                </m:sup>
-                <m:e>
-                  <m:r>
-                    <w:rPr>
-                      <w:rFonts w:ascii="Cambria Math" w:hAnsi="Cambria Math" w:cs="Arial"/>
-                      <w:sz w:val="20"/>
-                      <w:szCs w:val="20"/>
-                    </w:rPr>
-                    <m:t>E</m:t>
-                  </m:r>
-                  <m:d>
-                    <m:dPr>
-                      <m:ctrlPr>
-                        <w:rPr>
-                          <w:rFonts w:ascii="Cambria Math" w:hAnsi="Cambria Math" w:cs="Arial"/>
-                          <w:i/>
-                          <w:sz w:val="20"/>
-                          <w:szCs w:val="20"/>
-                        </w:rPr>
-                      </m:ctrlPr>
-                    </m:dPr>
-                    <m:e>
-                      <m:r>
-                        <w:rPr>
-                          <w:rFonts w:ascii="Cambria Math" w:hAnsi="Cambria Math" w:cs="Arial"/>
-                          <w:sz w:val="20"/>
-                          <w:szCs w:val="20"/>
-                        </w:rPr>
-                        <m:t>λ</m:t>
-                      </m:r>
-                    </m:e>
-                  </m:d>
-                  <m:r>
-                    <w:rPr>
-                      <w:rFonts w:ascii="Cambria Math" w:hAnsi="Cambria Math" w:cs="Arial"/>
-                      <w:sz w:val="20"/>
-                      <w:szCs w:val="20"/>
-                    </w:rPr>
-                    <m:t>·Δλ</m:t>
-                  </m:r>
-                </m:e>
-              </m:nary>
-            </m:den>
-          </m:f>
-        </m:oMath>
-      </m:oMathPara>
+      <w:r>
+        <w:rPr>
+          <w:rFonts w:ascii="Arial" w:hAnsi="Arial" w:cs="Arial"/>
+          <w:iCs/>
+          <w:sz w:val="20"/>
+          <w:szCs w:val="20"/>
+        </w:rPr>
+      </w:r>
     </w:p>
     <w:p>
       <w:pPr>
@@ -8776,8 +8548,8 @@
     </w:tbl>
     <w:p>
       <w:pPr>
-        <w:spacing w:before="80" w:after="80" w:line="312" w:lineRule="auto"/>
-        <w:jc w:val="center"/>
+        <w:spacing w:after="80" w:line="276" w:lineRule="auto"/>
+        <w:jc w:val="both"/>
         <w:rPr>
           <w:rFonts w:ascii="Arial" w:hAnsi="Arial" w:cs="Arial"/>
           <w:iCs/>
@@ -8785,242 +8557,14 @@
           <w:szCs w:val="20"/>
         </w:rPr>
       </w:pPr>
-      <m:oMathPara>
-        <m:oMath>
-          <m:sSub>
-            <m:sSubPr>
-              <m:ctrlPr>
-                <w:rPr>
-                  <w:rFonts w:ascii="Cambria Math" w:hAnsi="Cambria Math" w:cs="Arial"/>
-                  <w:i/>
-                  <w:sz w:val="20"/>
-                  <w:szCs w:val="20"/>
-                </w:rPr>
-              </m:ctrlPr>
-            </m:sSubPr>
-            <m:e>
-              <m:r>
-                <w:rPr>
-                  <w:rFonts w:ascii="Cambria Math" w:hAnsi="Cambria Math" w:cs="Arial"/>
-                  <w:sz w:val="20"/>
-                  <w:szCs w:val="20"/>
-                </w:rPr>
-                <m:t>τ</m:t>
-              </m:r>
-            </m:e>
-            <m:sub>
-              <m:r>
-                <w:rPr>
-                  <w:rFonts w:ascii="Cambria Math" w:hAnsi="Cambria Math" w:cs="Arial"/>
-                  <w:sz w:val="20"/>
-                  <w:szCs w:val="20"/>
-                </w:rPr>
-                <m:t>PV</m:t>
-              </m:r>
-            </m:sub>
-          </m:sSub>
-          <m:r>
-            <w:rPr>
-              <w:rFonts w:ascii="Cambria Math" w:hAnsi="Cambria Math" w:cs="Arial"/>
-              <w:sz w:val="20"/>
-              <w:szCs w:val="20"/>
-            </w:rPr>
-            <m:t>=</m:t>
-          </m:r>
-          <m:f>
-            <m:fPr>
-              <m:ctrlPr>
-                <w:rPr>
-                  <w:rFonts w:ascii="Cambria Math" w:hAnsi="Cambria Math" w:cs="Arial"/>
-                  <w:i/>
-                  <w:sz w:val="20"/>
-                  <w:szCs w:val="20"/>
-                </w:rPr>
-              </m:ctrlPr>
-            </m:fPr>
-            <m:num>
-              <m:nary>
-                <m:naryPr>
-                  <m:chr m:val="∑"/>
-                  <m:ctrlPr>
-                    <w:rPr>
-                      <w:rFonts w:ascii="Cambria Math" w:hAnsi="Cambria Math" w:cs="Arial"/>
-                      <w:i/>
-                      <w:sz w:val="20"/>
-                      <w:szCs w:val="20"/>
-                    </w:rPr>
-                  </m:ctrlPr>
-                </m:naryPr>
-                <m:sub>
-                  <m:r>
-                    <w:rPr>
-                      <w:rFonts w:ascii="Cambria Math" w:hAnsi="Cambria Math" w:cs="Arial"/>
-                      <w:sz w:val="20"/>
-                      <w:szCs w:val="20"/>
-                    </w:rPr>
-                    <m:t>λ=380</m:t>
-                  </m:r>
-                </m:sub>
-                <m:sup>
-                  <m:r>
-                    <w:rPr>
-                      <w:rFonts w:ascii="Cambria Math" w:hAnsi="Cambria Math" w:cs="Arial"/>
-                      <w:sz w:val="20"/>
-                      <w:szCs w:val="20"/>
-                    </w:rPr>
-                    <m:t>1100</m:t>
-                  </m:r>
-                </m:sup>
-                <m:e>
-                  <m:r>
-                    <w:rPr>
-                      <w:rFonts w:ascii="Cambria Math" w:hAnsi="Cambria Math" w:cs="Arial"/>
-                      <w:sz w:val="20"/>
-                      <w:szCs w:val="20"/>
-                    </w:rPr>
-                    <m:t>τ</m:t>
-                  </m:r>
-                  <m:d>
-                    <m:dPr>
-                      <m:ctrlPr>
-                        <w:rPr>
-                          <w:rFonts w:ascii="Cambria Math" w:hAnsi="Cambria Math" w:cs="Arial"/>
-                          <w:i/>
-                          <w:sz w:val="20"/>
-                          <w:szCs w:val="20"/>
-                        </w:rPr>
-                      </m:ctrlPr>
-                    </m:dPr>
-                    <m:e>
-                      <m:r>
-                        <w:rPr>
-                          <w:rFonts w:ascii="Cambria Math" w:hAnsi="Cambria Math" w:cs="Arial"/>
-                          <w:sz w:val="20"/>
-                          <w:szCs w:val="20"/>
-                        </w:rPr>
-                        <m:t>λ</m:t>
-                      </m:r>
-                    </m:e>
-                  </m:d>
-                  <m:r>
-                    <w:rPr>
-                      <w:rFonts w:ascii="Cambria Math" w:hAnsi="Cambria Math" w:cs="Arial"/>
-                      <w:sz w:val="20"/>
-                      <w:szCs w:val="20"/>
-                    </w:rPr>
-                    <m:t>·E</m:t>
-                  </m:r>
-                  <m:d>
-                    <m:dPr>
-                      <m:ctrlPr>
-                        <w:rPr>
-                          <w:rFonts w:ascii="Cambria Math" w:hAnsi="Cambria Math" w:cs="Arial"/>
-                          <w:i/>
-                          <w:sz w:val="20"/>
-                          <w:szCs w:val="20"/>
-                        </w:rPr>
-                      </m:ctrlPr>
-                    </m:dPr>
-                    <m:e>
-                      <m:r>
-                        <w:rPr>
-                          <w:rFonts w:ascii="Cambria Math" w:hAnsi="Cambria Math" w:cs="Arial"/>
-                          <w:sz w:val="20"/>
-                          <w:szCs w:val="20"/>
-                        </w:rPr>
-                        <m:t>λ</m:t>
-                      </m:r>
-                    </m:e>
-                  </m:d>
-                  <m:r>
-                    <w:rPr>
-                      <w:rFonts w:ascii="Cambria Math" w:hAnsi="Cambria Math" w:cs="Arial"/>
-                      <w:sz w:val="20"/>
-                      <w:szCs w:val="20"/>
-                    </w:rPr>
-                    <m:t>·Δλ</m:t>
-                  </m:r>
-                </m:e>
-              </m:nary>
-            </m:num>
-            <m:den>
-              <m:nary>
-                <m:naryPr>
-                  <m:chr m:val="∑"/>
-                  <m:ctrlPr>
-                    <w:rPr>
-                      <w:rFonts w:ascii="Cambria Math" w:hAnsi="Cambria Math" w:cs="Arial"/>
-                      <w:i/>
-                      <w:sz w:val="20"/>
-                      <w:szCs w:val="20"/>
-                    </w:rPr>
-                  </m:ctrlPr>
-                </m:naryPr>
-                <m:sub>
-                  <m:r>
-                    <w:rPr>
-                      <w:rFonts w:ascii="Cambria Math" w:hAnsi="Cambria Math" w:cs="Arial"/>
-                      <w:sz w:val="20"/>
-                      <w:szCs w:val="20"/>
-                    </w:rPr>
-                    <m:t>λ=380</m:t>
-                  </m:r>
-                </m:sub>
-                <m:sup>
-                  <m:r>
-                    <w:rPr>
-                      <w:rFonts w:ascii="Cambria Math" w:hAnsi="Cambria Math" w:cs="Arial"/>
-                      <w:sz w:val="20"/>
-                      <w:szCs w:val="20"/>
-                    </w:rPr>
-                    <m:t>1100</m:t>
-                  </m:r>
-                </m:sup>
-                <m:e>
-                  <m:r>
-                    <w:rPr>
-                      <w:rFonts w:ascii="Cambria Math" w:hAnsi="Cambria Math" w:cs="Arial"/>
-                      <w:sz w:val="20"/>
-                      <w:szCs w:val="20"/>
-                    </w:rPr>
-                    <m:t>E</m:t>
-                  </m:r>
-                  <m:d>
-                    <m:dPr>
-                      <m:ctrlPr>
-                        <w:rPr>
-                          <w:rFonts w:ascii="Cambria Math" w:hAnsi="Cambria Math" w:cs="Arial"/>
-                          <w:i/>
-                          <w:sz w:val="20"/>
-                          <w:szCs w:val="20"/>
-                        </w:rPr>
-                      </m:ctrlPr>
-                    </m:dPr>
-                    <m:e>
-                      <m:r>
-                        <w:rPr>
-                          <w:rFonts w:ascii="Cambria Math" w:hAnsi="Cambria Math" w:cs="Arial"/>
-                          <w:sz w:val="20"/>
-                          <w:szCs w:val="20"/>
-                        </w:rPr>
-                        <m:t>λ</m:t>
-                      </m:r>
-                    </m:e>
-                  </m:d>
-                  <m:r>
-                    <w:rPr>
-                      <w:rFonts w:ascii="Cambria Math" w:hAnsi="Cambria Math" w:cs="Arial"/>
-                      <w:sz w:val="20"/>
-                      <w:szCs w:val="20"/>
-                    </w:rPr>
-                    <m:t>·Δλ</m:t>
-                  </m:r>
-                </m:e>
-              </m:nary>
-            </m:den>
-          </m:f>
-        </m:oMath>
-      </m:oMathPara>
+      <w:r>
+        <w:rPr>
+          <w:rFonts w:ascii="Arial" w:hAnsi="Arial" w:cs="Arial"/>
+          <w:iCs/>
+          <w:sz w:val="20"/>
+          <w:szCs w:val="20"/>
+        </w:rPr>
+      </w:r>
     </w:p>
     <w:p>
       <w:pPr>

</xml_diff>